<commit_message>
feat: add document row auto expanding
</commit_message>
<xml_diff>
--- a/backend/public/templates/supervision-request.docx
+++ b/backend/public/templates/supervision-request.docx
@@ -114,9 +114,7 @@
         <w:gridCol w:w="721"/>
       </w:tblGrid>
       <w:tr>
-        <w:trPr>
-          <w:trHeight w:val="20" w:hRule="atLeast"/>
-        </w:trPr>
+        <w:trPr/>
         <w:tc>
           <w:tcPr>
             <w:tcW w:w="1956" w:type="dxa"/>
@@ -348,9 +346,7 @@
         <w:gridCol w:w="8552"/>
       </w:tblGrid>
       <w:tr>
-        <w:trPr>
-          <w:trHeight w:val="249" w:hRule="atLeast"/>
-        </w:trPr>
+        <w:trPr/>
         <w:tc>
           <w:tcPr>
             <w:tcW w:w="1345" w:type="dxa"/>
@@ -407,18 +403,164 @@
             <w:pPr>
               <w:pStyle w:val="Normal"/>
               <w:bidi w:val="1"/>
+              <w:jc w:val="left"/>
+              <w:rPr/>
+            </w:pPr>
+            <w:r>
+              <w:rPr>
+                <w:rtl w:val="true"/>
+              </w:rPr>
+            </w:r>
+            <w:r>
+              <w:rPr>
+                <w:rFonts w:ascii="Simplified Arabic" w:hAnsi="Simplified Arabic" w:cs="Simplified Arabic"/>
+                <w:sz w:val="26"/>
+                <w:szCs w:val="26"/>
+                <w:rtl/>
+                <w:lang w:bidi="ar-EG"/>
+              </w:rPr>
+              <w:t xml:space="preserve">{studentName}</w:t>
+            </w:r>
+          </w:p>
+        </w:tc>
+      </w:tr>
+    </w:tbl>
+    <w:p>
+      <w:pPr>
+        <w:pStyle w:val="Normal"/>
+        <w:bidi w:val="1"/>
+        <w:jc w:val="left"/>
+        <w:rPr>
+          <w:rFonts w:ascii="Simplified Arabic" w:hAnsi="Simplified Arabic" w:cs="Simplified Arabic"/>
+          <w:sz w:val="10"/>
+          <w:szCs w:val="10"/>
+          <w:lang w:bidi="ar-EG"/>
+        </w:rPr>
+      </w:pPr>
+      <w:r>
+        <w:rPr>
+          <w:rFonts w:cs="Simplified Arabic" w:ascii="Simplified Arabic" w:hAnsi="Simplified Arabic"/>
+          <w:sz w:val="10"/>
+          <w:szCs w:val="10"/>
+          <w:rtl w:val="true"/>
+          <w:lang w:bidi="ar-EG"/>
+        </w:rPr>
+      </w:r>
+    </w:p>
+    <w:tbl>
+      <w:tblPr>
+        <w:bidiVisual w:val="true"/>
+        <w:tblW w:w="9897" w:type="dxa"/>
+        <w:jc w:val="left"/>
+        <w:tblInd w:w="-597" w:type="dxa"/>
+        <w:tblLayout w:type="fixed"/>
+        <w:tblCellMar>
+          <w:top w:w="0" w:type="dxa"/>
+          <w:left w:w="108" w:type="dxa"/>
+          <w:bottom w:w="0" w:type="dxa"/>
+          <w:right w:w="108" w:type="dxa"/>
+        </w:tblCellMar>
+        <w:tblLook w:noHBand="0" w:noVBand="1" w:firstColumn="1" w:lastRow="0" w:lastColumn="0" w:firstRow="1" w:val="04a0"/>
+      </w:tblPr>
+      <w:tblGrid>
+        <w:gridCol w:w="2515"/>
+        <w:gridCol w:w="7382"/>
+      </w:tblGrid>
+      <w:tr>
+        <w:trPr/>
+        <w:tc>
+          <w:tcPr>
+            <w:tcW w:w="2515" w:type="dxa"/>
+            <w:tcBorders>
+              <w:right w:val="single" w:sz="4" w:space="0" w:color="000000"/>
+            </w:tcBorders>
+          </w:tcPr>
+          <w:p>
+            <w:pPr>
+              <w:pStyle w:val="Normal"/>
+              <w:bidi w:val="1"/>
               <w:ind w:right="-709"/>
               <w:jc w:val="left"/>
-              <w:rPr>
-                <w:rFonts w:ascii="Simplified Arabic" w:hAnsi="Simplified Arabic" w:cs="Simplified Arabic"/>
-                <w:sz w:val="26"/>
-                <w:szCs w:val="26"/>
-                <w:lang w:bidi="ar-EG"/>
-              </w:rPr>
-            </w:pPr>
+              <w:rPr/>
+            </w:pPr>
+            <w:r>
+              <w:rPr>
+                <w:rFonts w:ascii="Simplified Arabic" w:hAnsi="Simplified Arabic" w:cs="Simplified Arabic"/>
+                <w:b/>
+                <w:b/>
+                <w:bCs/>
+                <w:sz w:val="26"/>
+                <w:szCs w:val="26"/>
+                <w:rtl w:val="true"/>
+                <w:lang w:bidi="ar-EG"/>
+              </w:rPr>
+              <w:t xml:space="preserve">الرقم القومي </w:t>
+            </w:r>
             <w:r>
               <w:rPr>
                 <w:rFonts w:cs="Simplified Arabic" w:ascii="Simplified Arabic" w:hAnsi="Simplified Arabic"/>
+                <w:b/>
+                <w:bCs/>
+                <w:sz w:val="26"/>
+                <w:szCs w:val="26"/>
+                <w:rtl w:val="true"/>
+                <w:lang w:bidi="ar-EG"/>
+              </w:rPr>
+              <w:t xml:space="preserve">/ </w:t>
+            </w:r>
+            <w:r>
+              <w:rPr>
+                <w:rFonts w:ascii="Simplified Arabic" w:hAnsi="Simplified Arabic" w:cs="Simplified Arabic"/>
+                <w:b/>
+                <w:b/>
+                <w:bCs/>
+                <w:sz w:val="26"/>
+                <w:szCs w:val="26"/>
+                <w:rtl w:val="true"/>
+                <w:lang w:bidi="ar-EG"/>
+              </w:rPr>
+              <w:t>جواز السفر</w:t>
+            </w:r>
+            <w:r>
+              <w:rPr>
+                <w:rFonts w:cs="Simplified Arabic" w:ascii="Simplified Arabic" w:hAnsi="Simplified Arabic"/>
+                <w:b/>
+                <w:bCs/>
+                <w:sz w:val="26"/>
+                <w:szCs w:val="26"/>
+                <w:rtl w:val="true"/>
+                <w:lang w:bidi="ar-EG"/>
+              </w:rPr>
+              <w:t>:</w:t>
+            </w:r>
+          </w:p>
+        </w:tc>
+        <w:tc>
+          <w:tcPr>
+            <w:tcW w:w="7382" w:type="dxa"/>
+            <w:tcBorders>
+              <w:top w:val="single" w:sz="4" w:space="0" w:color="000000"/>
+              <w:left w:val="single" w:sz="4" w:space="0" w:color="000000"/>
+              <w:bottom w:val="single" w:sz="4" w:space="0" w:color="000000"/>
+              <w:right w:val="single" w:sz="4" w:space="0" w:color="000000"/>
+            </w:tcBorders>
+          </w:tcPr>
+          <w:p>
+            <w:pPr>
+              <w:pStyle w:val="Normal"/>
+              <w:bidi w:val="1"/>
+              <w:ind w:right="-709"/>
+              <w:jc w:val="left"/>
+              <w:rPr>
+                <w:rFonts w:ascii="Simplified Arabic" w:hAnsi="Simplified Arabic" w:cs="Simplified Arabic"/>
+                <w:sz w:val="26"/>
+                <w:szCs w:val="26"/>
+                <w:lang w:bidi="ar-EG"/>
+              </w:rPr>
+            </w:pPr>
+            <w:r>
+              <w:rPr>
+                <w:rFonts w:cs="Simplified Arabic" w:ascii="Simplified Arabic" w:hAnsi="Simplified Arabic"/>
                 <w:sz w:val="26"/>
                 <w:szCs w:val="26"/>
                 <w:rtl w:val="true"/>
@@ -433,7 +575,7 @@
                 <w:rtl/>
                 <w:lang w:bidi="ar-EG"/>
               </w:rPr>
-              <w:t xml:space="preserve">{studentName}</w:t>
+              <w:t xml:space="preserve">{nationalId}</w:t>
             </w:r>
           </w:p>
         </w:tc>
@@ -478,16 +620,14 @@
       </w:tblPr>
       <w:tblGrid>
         <w:gridCol w:w="1345"/>
-        <w:gridCol w:w="1744"/>
+        <w:gridCol w:w="1741"/>
         <w:gridCol w:w="2513"/>
-        <w:gridCol w:w="633"/>
-        <w:gridCol w:w="2157"/>
-        <w:gridCol w:w="1505"/>
+        <w:gridCol w:w="636"/>
+        <w:gridCol w:w="2154"/>
+        <w:gridCol w:w="1508"/>
       </w:tblGrid>
       <w:tr>
-        <w:trPr>
-          <w:trHeight w:val="380" w:hRule="atLeast"/>
-        </w:trPr>
+        <w:trPr/>
         <w:tc>
           <w:tcPr>
             <w:tcW w:w="1345" w:type="dxa"/>
@@ -532,7 +672,7 @@
         </w:tc>
         <w:tc>
           <w:tcPr>
-            <w:tcW w:w="1744" w:type="dxa"/>
+            <w:tcW w:w="1741" w:type="dxa"/>
             <w:tcBorders>
               <w:top w:val="single" w:sz="4" w:space="0" w:color="000000"/>
               <w:left w:val="single" w:sz="4" w:space="0" w:color="000000"/>
@@ -635,7 +775,7 @@
         </w:tc>
         <w:tc>
           <w:tcPr>
-            <w:tcW w:w="633" w:type="dxa"/>
+            <w:tcW w:w="636" w:type="dxa"/>
             <w:tcBorders>
               <w:top w:val="single" w:sz="4" w:space="0" w:color="000000"/>
               <w:left w:val="single" w:sz="4" w:space="0" w:color="000000"/>
@@ -683,7 +823,7 @@
         </w:tc>
         <w:tc>
           <w:tcPr>
-            <w:tcW w:w="2157" w:type="dxa"/>
+            <w:tcW w:w="2154" w:type="dxa"/>
             <w:tcBorders>
               <w:left w:val="single" w:sz="4" w:space="0" w:color="000000"/>
               <w:right w:val="single" w:sz="4" w:space="0" w:color="000000"/>
@@ -773,7 +913,7 @@
         </w:tc>
         <w:tc>
           <w:tcPr>
-            <w:tcW w:w="1505" w:type="dxa"/>
+            <w:tcW w:w="1508" w:type="dxa"/>
             <w:tcBorders>
               <w:top w:val="single" w:sz="4" w:space="0" w:color="000000"/>
               <w:left w:val="single" w:sz="4" w:space="0" w:color="000000"/>
@@ -862,18 +1002,16 @@
         <w:tblLook w:noHBand="0" w:noVBand="1" w:firstColumn="1" w:lastRow="0" w:lastColumn="0" w:firstRow="1" w:val="04a0"/>
       </w:tblPr>
       <w:tblGrid>
-        <w:gridCol w:w="112"/>
-        <w:gridCol w:w="1562"/>
-        <w:gridCol w:w="3194"/>
+        <w:gridCol w:w="109"/>
+        <w:gridCol w:w="1565"/>
+        <w:gridCol w:w="3191"/>
         <w:gridCol w:w="347"/>
-        <w:gridCol w:w="2057"/>
+        <w:gridCol w:w="2060"/>
         <w:gridCol w:w="2625"/>
         <w:gridCol w:w="11"/>
       </w:tblGrid>
       <w:tr>
-        <w:trPr>
-          <w:trHeight w:val="57" w:hRule="atLeast"/>
-        </w:trPr>
+        <w:trPr/>
         <w:tc>
           <w:tcPr>
             <w:tcW w:w="1674" w:type="dxa"/>
@@ -917,7 +1055,7 @@
         </w:tc>
         <w:tc>
           <w:tcPr>
-            <w:tcW w:w="3194" w:type="dxa"/>
+            <w:tcW w:w="3191" w:type="dxa"/>
             <w:tcBorders/>
           </w:tcPr>
           <w:p>
@@ -946,7 +1084,7 @@
         </w:tc>
         <w:tc>
           <w:tcPr>
-            <w:tcW w:w="2404" w:type="dxa"/>
+            <w:tcW w:w="2407" w:type="dxa"/>
             <w:gridSpan w:val="2"/>
             <w:tcBorders/>
           </w:tcPr>
@@ -997,12 +1135,10 @@
         </w:tc>
       </w:tr>
       <w:tr>
-        <w:trPr>
-          <w:trHeight w:val="57" w:hRule="atLeast"/>
-        </w:trPr>
-        <w:tc>
-          <w:tcPr>
-            <w:tcW w:w="112" w:type="dxa"/>
+        <w:trPr/>
+        <w:tc>
+          <w:tcPr>
+            <w:tcW w:w="109" w:type="dxa"/>
             <w:tcBorders/>
           </w:tcPr>
           <w:p>
@@ -1096,7 +1232,7 @@
         </w:tc>
         <w:tc>
           <w:tcPr>
-            <w:tcW w:w="4682" w:type="dxa"/>
+            <w:tcW w:w="4685" w:type="dxa"/>
             <w:gridSpan w:val="2"/>
             <w:tcBorders>
               <w:top w:val="single" w:sz="4" w:space="0" w:color="000000"/>
@@ -1184,13 +1320,10 @@
         </w:r>
       </w:p>
       <w:tr>
-        <w:trPr>
-          <w:trHeight w:val="340" w:hRule="atLeast"/>
-          <w:cantSplit/>
-        </w:trPr>
-        <w:tc>
-          <w:tcPr>
-            <w:tcW w:w="112" w:type="dxa"/>
+        <w:trPr/>
+        <w:tc>
+          <w:tcPr>
+            <w:tcW w:w="109" w:type="dxa"/>
             <w:tcBorders/>
           </w:tcPr>
           <w:p>
@@ -1228,14 +1361,19 @@
               <w:bottom w:val="single" w:sz="4" w:space="0" w:color="000000"/>
               <w:right w:val="single" w:sz="4" w:space="0" w:color="000000"/>
             </w:tcBorders>
+            <w:tcMar>
+              <w:top w:w="60" w:type="dxa"/>
+              <w:left w:w="100" w:type="dxa"/>
+              <w:bottom w:w="60" w:type="dxa"/>
+              <w:right w:w="100" w:type="dxa"/>
+            </w:tcMar>
             <w:vAlign w:val="center"/>
           </w:tcPr>
           <w:p>
             <w:pPr>
               <w:pStyle w:val="Normal"/>
               <w:bidi w:val="1"/>
-              <w:spacing w:lineRule="auto" w:line="120"/>
-              <w:ind w:right="-709"/>
+              <w:spacing w:line="180" w:lineRule="auto"/>
               <w:jc w:val="left"/>
               <w:rPr>
                 <w:rFonts w:ascii="Simplified Arabic" w:hAnsi="Simplified Arabic" w:cs="Simplified Arabic"/>
@@ -1267,7 +1405,7 @@
         </w:tc>
         <w:tc>
           <w:tcPr>
-            <w:tcW w:w="4682" w:type="dxa"/>
+            <w:tcW w:w="4685" w:type="dxa"/>
             <w:gridSpan w:val="2"/>
             <w:tcBorders>
               <w:top w:val="single" w:sz="4" w:space="0" w:color="000000"/>
@@ -1275,14 +1413,19 @@
               <w:bottom w:val="single" w:sz="4" w:space="0" w:color="000000"/>
               <w:right w:val="single" w:sz="4" w:space="0" w:color="000000"/>
             </w:tcBorders>
+            <w:tcMar>
+              <w:top w:w="60" w:type="dxa"/>
+              <w:left w:w="100" w:type="dxa"/>
+              <w:bottom w:w="60" w:type="dxa"/>
+              <w:right w:w="100" w:type="dxa"/>
+            </w:tcMar>
             <w:vAlign w:val="center"/>
           </w:tcPr>
           <w:p>
             <w:pPr>
               <w:pStyle w:val="Normal"/>
               <w:bidi w:val="1"/>
-              <w:spacing w:lineRule="auto" w:line="120"/>
-              <w:ind w:right="-709"/>
+              <w:spacing w:line="180" w:lineRule="auto"/>
               <w:jc w:val="left"/>
               <w:rPr>
                 <w:rFonts w:ascii="Simplified Arabic" w:hAnsi="Simplified Arabic" w:cs="Simplified Arabic"/>
@@ -1384,9 +1527,7 @@
         <w:gridCol w:w="8287"/>
       </w:tblGrid>
       <w:tr>
-        <w:trPr>
-          <w:trHeight w:val="1048" w:hRule="atLeast"/>
-        </w:trPr>
+        <w:trPr/>
         <w:tc>
           <w:tcPr>
             <w:tcW w:w="1610" w:type="dxa"/>
@@ -1584,15 +1725,13 @@
       </w:tblPr>
       <w:tblGrid>
         <w:gridCol w:w="1816"/>
-        <w:gridCol w:w="1556"/>
-        <w:gridCol w:w="1780"/>
-        <w:gridCol w:w="1481"/>
-        <w:gridCol w:w="3264"/>
+        <w:gridCol w:w="1553"/>
+        <w:gridCol w:w="1783"/>
+        <w:gridCol w:w="1478"/>
+        <w:gridCol w:w="3267"/>
       </w:tblGrid>
       <w:tr>
-        <w:trPr>
-          <w:trHeight w:val="255" w:hRule="atLeast"/>
-        </w:trPr>
+        <w:trPr/>
         <w:tc>
           <w:tcPr>
             <w:tcW w:w="1816" w:type="dxa"/>
@@ -1788,9 +1927,7 @@
         </w:tc>
       </w:tr>
       <w:tr>
-        <w:trPr>
-          <w:trHeight w:val="255" w:hRule="atLeast"/>
-        </w:trPr>
+        <w:trPr/>
         <w:tc>
           <w:tcPr>
             <w:tcW w:w="1816" w:type="dxa"/>
@@ -1827,7 +1964,7 @@
         </w:tc>
         <w:tc>
           <w:tcPr>
-            <w:tcW w:w="1556" w:type="dxa"/>
+            <w:tcW w:w="1553" w:type="dxa"/>
             <w:tcBorders>
               <w:top w:val="single" w:sz="4" w:space="0" w:color="000000"/>
               <w:left w:val="single" w:sz="4" w:space="0" w:color="000000"/>
@@ -1873,7 +2010,7 @@
         </w:tc>
         <w:tc>
           <w:tcPr>
-            <w:tcW w:w="1780" w:type="dxa"/>
+            <w:tcW w:w="1783" w:type="dxa"/>
             <w:tcBorders>
               <w:top w:val="single" w:sz="4" w:space="0" w:color="000000"/>
               <w:left w:val="single" w:sz="4" w:space="0" w:color="000000"/>
@@ -1919,7 +2056,7 @@
         </w:tc>
         <w:tc>
           <w:tcPr>
-            <w:tcW w:w="1481" w:type="dxa"/>
+            <w:tcW w:w="1478" w:type="dxa"/>
             <w:tcBorders>
               <w:top w:val="single" w:sz="4" w:space="0" w:color="000000"/>
               <w:left w:val="single" w:sz="4" w:space="0" w:color="000000"/>
@@ -1965,7 +2102,7 @@
         </w:tc>
         <w:tc>
           <w:tcPr>
-            <w:tcW w:w="3264" w:type="dxa"/>
+            <w:tcW w:w="3267" w:type="dxa"/>
             <w:tcBorders>
               <w:top w:val="single" w:sz="4" w:space="0" w:color="000000"/>
               <w:left w:val="single" w:sz="4" w:space="0" w:color="000000"/>
@@ -2011,9 +2148,7 @@
         </w:tc>
       </w:tr>
       <w:tr>
-        <w:trPr>
-          <w:trHeight w:val="791" w:hRule="atLeast"/>
-        </w:trPr>
+        <w:trPr/>
         <w:tc>
           <w:tcPr>
             <w:tcW w:w="1816" w:type="dxa"/>
@@ -2049,7 +2184,7 @@
         </w:tc>
         <w:tc>
           <w:tcPr>
-            <w:tcW w:w="1556" w:type="dxa"/>
+            <w:tcW w:w="1553" w:type="dxa"/>
             <w:tcBorders>
               <w:top w:val="single" w:sz="4" w:space="0" w:color="000000"/>
               <w:left w:val="single" w:sz="4" w:space="0" w:color="000000"/>
@@ -2089,7 +2224,7 @@
         </w:tc>
         <w:tc>
           <w:tcPr>
-            <w:tcW w:w="1780" w:type="dxa"/>
+            <w:tcW w:w="1783" w:type="dxa"/>
             <w:tcBorders>
               <w:top w:val="single" w:sz="4" w:space="0" w:color="000000"/>
               <w:left w:val="single" w:sz="4" w:space="0" w:color="000000"/>
@@ -2133,7 +2268,7 @@
         </w:tc>
         <w:tc>
           <w:tcPr>
-            <w:tcW w:w="1481" w:type="dxa"/>
+            <w:tcW w:w="1478" w:type="dxa"/>
             <w:tcBorders>
               <w:top w:val="single" w:sz="4" w:space="0" w:color="000000"/>
               <w:left w:val="single" w:sz="4" w:space="0" w:color="000000"/>
@@ -2177,7 +2312,7 @@
         </w:tc>
         <w:tc>
           <w:tcPr>
-            <w:tcW w:w="3264" w:type="dxa"/>
+            <w:tcW w:w="3267" w:type="dxa"/>
             <w:tcBorders>
               <w:top w:val="single" w:sz="4" w:space="0" w:color="000000"/>
               <w:left w:val="single" w:sz="4" w:space="0" w:color="000000"/>
@@ -2271,17 +2406,15 @@
         <w:tblLook w:noHBand="0" w:noVBand="1" w:firstColumn="1" w:lastRow="0" w:lastColumn="0" w:firstRow="1" w:val="04a0"/>
       </w:tblPr>
       <w:tblGrid>
-        <w:gridCol w:w="3966"/>
-        <w:gridCol w:w="3122"/>
+        <w:gridCol w:w="3963"/>
+        <w:gridCol w:w="3125"/>
         <w:gridCol w:w="2694"/>
       </w:tblGrid>
       <w:tr>
-        <w:trPr>
-          <w:trHeight w:val="380" w:hRule="atLeast"/>
-        </w:trPr>
-        <w:tc>
-          <w:tcPr>
-            <w:tcW w:w="3966" w:type="dxa"/>
+        <w:trPr/>
+        <w:tc>
+          <w:tcPr>
+            <w:tcW w:w="3963" w:type="dxa"/>
             <w:tcBorders>
               <w:top w:val="single" w:sz="4" w:space="0" w:color="000000"/>
               <w:left w:val="single" w:sz="4" w:space="0" w:color="000000"/>
@@ -2341,7 +2474,7 @@
         </w:tc>
         <w:tc>
           <w:tcPr>
-            <w:tcW w:w="3122" w:type="dxa"/>
+            <w:tcW w:w="3125" w:type="dxa"/>
             <w:tcBorders>
               <w:top w:val="single" w:sz="4" w:space="0" w:color="000000"/>
               <w:left w:val="single" w:sz="4" w:space="0" w:color="000000"/>
@@ -2500,12 +2633,10 @@
         </w:r>
       </w:p>
       <w:tr>
-        <w:trPr>
-          <w:trHeight w:val="380" w:hRule="atLeast"/>
-        </w:trPr>
-        <w:tc>
-          <w:tcPr>
-            <w:tcW w:w="3966" w:type="dxa"/>
+        <w:trPr/>
+        <w:tc>
+          <w:tcPr>
+            <w:tcW w:w="3963" w:type="dxa"/>
             <w:tcBorders>
               <w:top w:val="single" w:sz="4" w:space="0" w:color="000000"/>
               <w:left w:val="single" w:sz="4" w:space="0" w:color="000000"/>
@@ -2550,7 +2681,7 @@
         </w:tc>
         <w:tc>
           <w:tcPr>
-            <w:tcW w:w="3122" w:type="dxa"/>
+            <w:tcW w:w="3125" w:type="dxa"/>
             <w:tcBorders>
               <w:top w:val="single" w:sz="4" w:space="0" w:color="000000"/>
               <w:left w:val="single" w:sz="4" w:space="0" w:color="000000"/>
@@ -2581,7 +2712,7 @@
                 <w:lang w:bidi="ar-EG"/>
               </w:rPr>
               <w:drawing>
-                <wp:anchor distT="0" distB="0" distL="0" distR="0" simplePos="0" relativeHeight="5" behindDoc="0" locked="0" layoutInCell="1" allowOverlap="1">
+                <wp:anchor distT="0" distB="0" distL="0" distR="0" simplePos="0" relativeHeight="7" behindDoc="0" locked="0" layoutInCell="1" allowOverlap="1">
                   <wp:simplePos x="0" y="0"/>
                   <wp:positionH relativeFrom="column">
                     <wp:posOffset>-356235</wp:posOffset>
@@ -2660,7 +2791,7 @@
             </w:pPr>
             <w:r>
               <w:drawing>
-                <wp:anchor distT="0" distB="0" distL="0" distR="0" simplePos="0" relativeHeight="6" behindDoc="0" locked="0" layoutInCell="1" allowOverlap="1">
+                <wp:anchor distT="0" distB="0" distL="0" distR="0" simplePos="0" relativeHeight="8" behindDoc="0" locked="0" layoutInCell="1" allowOverlap="1">
                   <wp:simplePos x="0" y="0"/>
                   <wp:positionH relativeFrom="column">
                     <wp:posOffset>440690</wp:posOffset>
@@ -2708,10 +2839,10 @@
               <mc:AlternateContent>
                 <mc:Choice Requires="wps">
                   <w:drawing>
-                    <wp:anchor distT="1905" distB="635" distL="1270" distR="1270" simplePos="0" relativeHeight="8" behindDoc="0" locked="0" layoutInCell="1" allowOverlap="1">
+                    <wp:anchor distT="1905" distB="635" distL="1270" distR="1270" simplePos="0" relativeHeight="10" behindDoc="0" locked="0" layoutInCell="1" allowOverlap="1">
                       <wp:simplePos x="0" y="0"/>
                       <wp:positionH relativeFrom="column">
-                        <wp:posOffset>-45979715</wp:posOffset>
+                        <wp:posOffset>-2147483648</wp:posOffset>
                       </wp:positionH>
                       <wp:positionV relativeFrom="paragraph">
                         <wp:posOffset>47625</wp:posOffset>
@@ -2758,7 +2889,7 @@
                 </mc:Choice>
                 <mc:Fallback>
                   <w:pict>
-                    <v:roundrect id="shape_0" fillcolor="white" stroked="t" o:allowincell="t" style="position:absolute;margin-left:-3620.45pt;margin-top:3.75pt;width:11.2pt;height:9.7pt;mso-wrap-style:none;v-text-anchor:middle">
+                    <v:roundrect id="shape_0" fillcolor="white" stroked="t" o:allowincell="t" style="position:absolute;margin-left:-676015.7pt;margin-top:3.75pt;width:11.2pt;height:9.7pt;mso-wrap-style:none;v-text-anchor:middle">
                       <v:fill o:detectmouseclick="t" type="solid" color2="black"/>
                       <v:stroke color="black" joinstyle="round" endcap="flat"/>
                       <w10:wrap type="none"/>
@@ -2769,10 +2900,10 @@
               <mc:AlternateContent>
                 <mc:Choice Requires="wps">
                   <w:drawing>
-                    <wp:anchor distT="635" distB="635" distL="635" distR="635" simplePos="0" relativeHeight="10" behindDoc="0" locked="0" layoutInCell="1" allowOverlap="1">
+                    <wp:anchor distT="635" distB="635" distL="635" distR="635" simplePos="0" relativeHeight="12" behindDoc="0" locked="0" layoutInCell="1" allowOverlap="1">
                       <wp:simplePos x="0" y="0"/>
                       <wp:positionH relativeFrom="column">
-                        <wp:posOffset>-96110425</wp:posOffset>
+                        <wp:posOffset>-2147483648</wp:posOffset>
                       </wp:positionH>
                       <wp:positionV relativeFrom="paragraph">
                         <wp:posOffset>268605</wp:posOffset>
@@ -2819,7 +2950,7 @@
                 </mc:Choice>
                 <mc:Fallback>
                   <w:pict>
-                    <v:roundrect id="shape_0" fillcolor="white" stroked="t" o:allowincell="t" style="position:absolute;margin-left:-7567.75pt;margin-top:21.15pt;width:16.1pt;height:13.25pt;mso-wrap-style:none;v-text-anchor:middle">
+                    <v:roundrect id="shape_0" fillcolor="white" stroked="t" o:allowincell="t" style="position:absolute;margin-left:-676001pt;margin-top:21.15pt;width:16.1pt;height:13.25pt;mso-wrap-style:none;v-text-anchor:middle">
                       <v:fill o:detectmouseclick="t" type="solid" color2="black"/>
                       <v:stroke color="black" joinstyle="round" endcap="flat"/>
                       <w10:wrap type="none"/>
@@ -2932,17 +3063,15 @@
         <w:tblLook w:noHBand="0" w:noVBand="1" w:firstColumn="1" w:lastRow="0" w:lastColumn="0" w:firstRow="1" w:val="04a0"/>
       </w:tblPr>
       <w:tblGrid>
-        <w:gridCol w:w="112"/>
-        <w:gridCol w:w="1233"/>
-        <w:gridCol w:w="3587"/>
+        <w:gridCol w:w="109"/>
+        <w:gridCol w:w="1236"/>
+        <w:gridCol w:w="3584"/>
         <w:gridCol w:w="2008"/>
-        <w:gridCol w:w="2639"/>
+        <w:gridCol w:w="2642"/>
         <w:gridCol w:w="318"/>
       </w:tblGrid>
       <w:tr>
-        <w:trPr>
-          <w:trHeight w:val="380" w:hRule="atLeast"/>
-        </w:trPr>
+        <w:trPr/>
         <w:tc>
           <w:tcPr>
             <w:tcW w:w="1345" w:type="dxa"/>
@@ -2986,7 +3115,7 @@
         </w:tc>
         <w:tc>
           <w:tcPr>
-            <w:tcW w:w="3587" w:type="dxa"/>
+            <w:tcW w:w="3584" w:type="dxa"/>
             <w:tcBorders/>
           </w:tcPr>
           <w:p>
@@ -3035,7 +3164,7 @@
         </w:tc>
         <w:tc>
           <w:tcPr>
-            <w:tcW w:w="2639" w:type="dxa"/>
+            <w:tcW w:w="2642" w:type="dxa"/>
             <w:tcBorders/>
           </w:tcPr>
           <w:p>
@@ -3087,12 +3216,10 @@
         </w:tc>
       </w:tr>
       <w:tr>
-        <w:trPr>
-          <w:trHeight w:val="380" w:hRule="atLeast"/>
-        </w:trPr>
-        <w:tc>
-          <w:tcPr>
-            <w:tcW w:w="112" w:type="dxa"/>
+        <w:trPr/>
+        <w:tc>
+          <w:tcPr>
+            <w:tcW w:w="109" w:type="dxa"/>
             <w:tcBorders/>
           </w:tcPr>
           <w:p>
@@ -3186,7 +3313,7 @@
         </w:tc>
         <w:tc>
           <w:tcPr>
-            <w:tcW w:w="4965" w:type="dxa"/>
+            <w:tcW w:w="4968" w:type="dxa"/>
             <w:gridSpan w:val="3"/>
             <w:tcBorders>
               <w:top w:val="single" w:sz="4" w:space="0" w:color="000000"/>
@@ -3226,12 +3353,10 @@
         </w:r>
       </w:p>
       <w:tr>
-        <w:trPr>
-          <w:trHeight w:val="340" w:hRule="atLeast"/>
-        </w:trPr>
-        <w:tc>
-          <w:tcPr>
-            <w:tcW w:w="112" w:type="dxa"/>
+        <w:trPr/>
+        <w:tc>
+          <w:tcPr>
+            <w:tcW w:w="109" w:type="dxa"/>
             <w:tcBorders/>
           </w:tcPr>
           <w:p>
@@ -3269,14 +3394,19 @@
               <w:bottom w:val="single" w:sz="4" w:space="0" w:color="000000"/>
               <w:right w:val="single" w:sz="4" w:space="0" w:color="000000"/>
             </w:tcBorders>
+            <w:tcMar>
+              <w:top w:w="60" w:type="dxa"/>
+              <w:left w:w="100" w:type="dxa"/>
+              <w:bottom w:w="60" w:type="dxa"/>
+              <w:right w:w="100" w:type="dxa"/>
+            </w:tcMar>
             <w:vAlign w:val="center"/>
           </w:tcPr>
           <w:p>
             <w:pPr>
               <w:pStyle w:val="Normal"/>
               <w:bidi w:val="1"/>
-              <w:spacing w:lineRule="auto" w:line="120"/>
-              <w:ind w:right="-709"/>
+              <w:spacing w:line="180" w:lineRule="auto"/>
               <w:jc w:val="left"/>
               <w:rPr>
                 <w:rFonts w:ascii="Simplified Arabic" w:hAnsi="Simplified Arabic" w:cs="Simplified Arabic"/>
@@ -3308,7 +3438,7 @@
         </w:tc>
         <w:tc>
           <w:tcPr>
-            <w:tcW w:w="4965" w:type="dxa"/>
+            <w:tcW w:w="4968" w:type="dxa"/>
             <w:gridSpan w:val="3"/>
             <w:tcBorders>
               <w:top w:val="single" w:sz="4" w:space="0" w:color="000000"/>
@@ -3316,14 +3446,19 @@
               <w:bottom w:val="single" w:sz="4" w:space="0" w:color="000000"/>
               <w:right w:val="single" w:sz="4" w:space="0" w:color="000000"/>
             </w:tcBorders>
+            <w:tcMar>
+              <w:top w:w="60" w:type="dxa"/>
+              <w:left w:w="100" w:type="dxa"/>
+              <w:bottom w:w="60" w:type="dxa"/>
+              <w:right w:w="100" w:type="dxa"/>
+            </w:tcMar>
             <w:vAlign w:val="center"/>
           </w:tcPr>
           <w:p>
             <w:pPr>
               <w:pStyle w:val="Normal"/>
               <w:bidi w:val="1"/>
-              <w:spacing w:lineRule="auto" w:line="120"/>
-              <w:ind w:right="-709"/>
+              <w:spacing w:line="180" w:lineRule="auto"/>
               <w:jc w:val="left"/>
               <w:rPr>
                 <w:rFonts w:ascii="Simplified Arabic" w:hAnsi="Simplified Arabic" w:cs="Simplified Arabic"/>
@@ -3431,8 +3566,8 @@
     <w:tblGrid>
       <w:gridCol w:w="1181"/>
       <w:gridCol w:w="3280"/>
-      <w:gridCol w:w="4767"/>
-      <w:gridCol w:w="1572"/>
+      <w:gridCol w:w="4766"/>
+      <w:gridCol w:w="1573"/>
     </w:tblGrid>
     <w:tr>
       <w:trPr>
@@ -3636,7 +3771,7 @@
       </w:tc>
       <w:tc>
         <w:tcPr>
-          <w:tcW w:w="4767" w:type="dxa"/>
+          <w:tcW w:w="4766" w:type="dxa"/>
           <w:tcBorders/>
         </w:tcPr>
         <w:p>
@@ -3721,7 +3856,7 @@
       </w:tc>
       <w:tc>
         <w:tcPr>
-          <w:tcW w:w="1572" w:type="dxa"/>
+          <w:tcW w:w="1573" w:type="dxa"/>
           <w:tcBorders/>
           <w:vAlign w:val="center"/>
         </w:tcPr>
@@ -3812,8 +3947,8 @@
     <w:tblGrid>
       <w:gridCol w:w="1181"/>
       <w:gridCol w:w="3280"/>
-      <w:gridCol w:w="4767"/>
-      <w:gridCol w:w="1572"/>
+      <w:gridCol w:w="4766"/>
+      <w:gridCol w:w="1573"/>
     </w:tblGrid>
     <w:tr>
       <w:trPr>
@@ -4017,7 +4152,7 @@
       </w:tc>
       <w:tc>
         <w:tcPr>
-          <w:tcW w:w="4767" w:type="dxa"/>
+          <w:tcW w:w="4766" w:type="dxa"/>
           <w:tcBorders/>
         </w:tcPr>
         <w:p>
@@ -4102,7 +4237,7 @@
       </w:tc>
       <w:tc>
         <w:tcPr>
-          <w:tcW w:w="1572" w:type="dxa"/>
+          <w:tcW w:w="1573" w:type="dxa"/>
           <w:tcBorders/>
           <w:vAlign w:val="center"/>
         </w:tcPr>
@@ -4659,16 +4794,16 @@
       <w:lang w:val="en-US" w:eastAsia="en-US"/>
     </w:rPr>
   </w:style>
-  <w:style w:type="character" w:styleId="FootnoteCharacters">
-    <w:name w:val="Footnote Characters"/>
+  <w:style w:type="character" w:styleId="FootnoteCharactersuser">
+    <w:name w:val="Footnote Characters (user)"/>
     <w:qFormat/>
     <w:rsid w:val="000b1fa2"/>
     <w:rPr>
       <w:vertAlign w:val="superscript"/>
     </w:rPr>
   </w:style>
-  <w:style w:type="character" w:styleId="FootnoteCharactersuser">
-    <w:name w:val="Footnote Characters (user)"/>
+  <w:style w:type="character" w:styleId="FootnoteCharacters">
+    <w:name w:val="Footnote Characters"/>
     <w:qFormat/>
     <w:rPr>
       <w:vertAlign w:val="superscript"/>

</xml_diff>